<commit_message>
docs: regenerate Book III exception-based working edition
</commit_message>
<xml_diff>
--- a/Documents/Book III/deliverables/HAL_BOOK_III_ENGINEERING_STANDARDS.docx
+++ b/Documents/Book III/deliverables/HAL_BOOK_III_ENGINEERING_STANDARDS.docx
@@ -21,13 +21,15 @@
         <w:rPr>
           <w:i/>
         </w:rPr>
-        <w:t>Final v1.0 | 27 July 2026</w:t>
+        <w:t>Owner-authorized working amendment v1.1 | 9 August 2026</w:t>
         <w:br/>
         <w:t>Book I is supreme. Book II is authoritative.</w:t>
       </w:r>
     </w:p>
     <w:p>
-      <w:r/>
+      <w:r>
+        <w:br w:type="page"/>
+      </w:r>
     </w:p>
     <w:p>
       <w:pPr>
@@ -129,7 +131,7 @@
     </w:p>
     <w:p>
       <w:r>
-        <w:t>Status: Final. Control families: GOV-001 GOV-002 GOV-003 GOV-004 GOV-005. Version: 1.0. Source authority: Book I then Book II.</w:t>
+        <w:t>Status: Owner-authorized working amendment; recertification pending. Control families: GOV-001 GOV-002 GOV-003 GOV-004 GOV-005. Version: 1.1. Source authority: Book I then Book II.</w:t>
       </w:r>
     </w:p>
     <w:p>
@@ -337,7 +339,7 @@
     </w:p>
     <w:p>
       <w:r>
-        <w:t>Verify through automated checks, independent review, and risk-scaled test/release evidence. Critical invariants require an identified repeatable verification method; critical failure modes require tested containment or recovery.</w:t>
+        <w:t>Verify through automated checks and risk-scaled test/release evidence, plus independent review or the documented Solo-Owner Assurance Profile where Book III Chapter 8 §11.1 permits it. Critical invariants require an identified repeatable verification method; critical failure modes require tested containment or recovery.</w:t>
       </w:r>
     </w:p>
     <w:p>
@@ -462,7 +464,7 @@
     </w:p>
     <w:p>
       <w:r>
-        <w:t>Status: Final. Control families: SRC-001 SRC-002 SRC-003 SRC-004 SRC-005 SRC-006. Version: 1.0. Source authority: Book I then Book II.</w:t>
+        <w:t>Status: Owner-authorized working amendment; recertification pending. Control families: SRC-001 SRC-002 SRC-003 SRC-004 SRC-005 SRC-006. Version: 1.1. Source authority: Book I then Book II.</w:t>
       </w:r>
     </w:p>
     <w:p>
@@ -670,7 +672,7 @@
     </w:p>
     <w:p>
       <w:r>
-        <w:t>Verify through automated checks, independent review, and risk-scaled test/release evidence. Critical invariants require an identified repeatable verification method; critical failure modes require tested containment or recovery.</w:t>
+        <w:t>Verify through automated checks and risk-scaled test/release evidence, plus independent review or the documented Solo-Owner Assurance Profile where Book III Chapter 8 §11.1 permits it. Critical invariants require an identified repeatable verification method; critical failure modes require tested containment or recovery.</w:t>
       </w:r>
     </w:p>
     <w:p>
@@ -795,7 +797,7 @@
     </w:p>
     <w:p>
       <w:r>
-        <w:t>Status: Final. Control families: DES-001 DES-002 DES-003 DES-004 DES-005 DES-006. Version: 1.0. Source authority: Book I then Book II.</w:t>
+        <w:t>Status: Owner-authorized working amendment; recertification pending. Control families: DES-001 DES-002 DES-003 DES-004 DES-005 DES-006. Version: 1.1. Source authority: Book I then Book II.</w:t>
       </w:r>
     </w:p>
     <w:p>
@@ -1003,7 +1005,7 @@
     </w:p>
     <w:p>
       <w:r>
-        <w:t>Verify through automated checks, independent review, and risk-scaled test/release evidence. Critical invariants require an identified repeatable verification method; critical failure modes require tested containment or recovery.</w:t>
+        <w:t>Verify through automated checks and risk-scaled test/release evidence, plus independent review or the documented Solo-Owner Assurance Profile where Book III Chapter 8 §11.1 permits it. Critical invariants require an identified repeatable verification method; critical failure modes require tested containment or recovery.</w:t>
       </w:r>
     </w:p>
     <w:p>
@@ -1128,7 +1130,7 @@
     </w:p>
     <w:p>
       <w:r>
-        <w:t>Status: Final. Control families: OBS-001 OBS-002 OBS-003 OBS-004 DOC-001. Version: 1.0. Source authority: Book I then Book II.</w:t>
+        <w:t>Status: Owner-authorized working amendment; recertification pending. Control families: OBS-001 OBS-002 OBS-003 OBS-004 DOC-001. Version: 1.1. Source authority: Book I then Book II.</w:t>
       </w:r>
     </w:p>
     <w:p>
@@ -1336,7 +1338,7 @@
     </w:p>
     <w:p>
       <w:r>
-        <w:t>Verify through automated checks, independent review, and risk-scaled test/release evidence. Critical invariants require an identified repeatable verification method; critical failure modes require tested containment or recovery.</w:t>
+        <w:t>Verify through automated checks and risk-scaled test/release evidence, plus independent review or the documented Solo-Owner Assurance Profile where Book III Chapter 8 §11.1 permits it. Critical invariants require an identified repeatable verification method; critical failure modes require tested containment or recovery.</w:t>
       </w:r>
     </w:p>
     <w:p>
@@ -1461,7 +1463,7 @@
     </w:p>
     <w:p>
       <w:r>
-        <w:t>Status: Final. Control families: SEC-001 SEC-002 SEC-003 SEC-004 SEC-005 SEC-006 PRV-001 PRV-002. Version: 1.0. Source authority: Book I then Book II.</w:t>
+        <w:t>Status: Owner-authorized working amendment; recertification pending. Control families: SEC-001 SEC-002 SEC-003 SEC-004 SEC-005 SEC-006 PRV-001 PRV-002. Version: 1.1. Source authority: Book I then Book II.</w:t>
       </w:r>
     </w:p>
     <w:p>
@@ -1669,7 +1671,7 @@
     </w:p>
     <w:p>
       <w:r>
-        <w:t>Verify through automated checks, independent review, and risk-scaled test/release evidence. Critical invariants require an identified repeatable verification method; critical failure modes require tested containment or recovery.</w:t>
+        <w:t>Verify through automated checks and risk-scaled test/release evidence, plus independent review or the documented Solo-Owner Assurance Profile where Book III Chapter 8 §11.1 permits it. Critical invariants require an identified repeatable verification method; critical failure modes require tested containment or recovery.</w:t>
       </w:r>
     </w:p>
     <w:p>
@@ -1794,7 +1796,7 @@
     </w:p>
     <w:p>
       <w:r>
-        <w:t>Status: Final. Control families: TST-001 TST-002 TST-003 TST-004 VER-001 VER-002 VER-003. Version: 1.0. Source authority: Book I then Book II.</w:t>
+        <w:t>Status: Owner-authorized working amendment; recertification pending. Control families: TST-001 TST-002 TST-003 TST-004 VER-001 VER-002 VER-003. Version: 1.1. Source authority: Book I then Book II.</w:t>
       </w:r>
     </w:p>
     <w:p>
@@ -2002,7 +2004,7 @@
     </w:p>
     <w:p>
       <w:r>
-        <w:t>Verify through automated checks, independent review, and risk-scaled test/release evidence. Critical invariants require an identified repeatable verification method; critical failure modes require tested containment or recovery.</w:t>
+        <w:t>Verify through automated checks and risk-scaled test/release evidence, plus independent review or the documented Solo-Owner Assurance Profile where Book III Chapter 8 §11.1 permits it. Critical invariants require an identified repeatable verification method; critical failure modes require tested containment or recovery.</w:t>
       </w:r>
     </w:p>
     <w:p>
@@ -2127,7 +2129,7 @@
     </w:p>
     <w:p>
       <w:r>
-        <w:t>Status: Final. Control families: BLD-001 BLD-002 BLD-003 RELSE-001 RELSE-002 RELSE-003. Version: 1.0. Source authority: Book I then Book II.</w:t>
+        <w:t>Status: Owner-authorized working amendment; recertification pending. Control families: BLD-001 BLD-002 BLD-003 RELSE-001 RELSE-002 RELSE-003. Version: 1.1. Source authority: Book I then Book II.</w:t>
       </w:r>
     </w:p>
     <w:p>
@@ -2335,7 +2337,7 @@
     </w:p>
     <w:p>
       <w:r>
-        <w:t>Verify through automated checks, independent review, and risk-scaled test/release evidence. Critical invariants require an identified repeatable verification method; critical failure modes require tested containment or recovery.</w:t>
+        <w:t>Verify through automated checks and risk-scaled test/release evidence, plus independent review or the documented Solo-Owner Assurance Profile where Book III Chapter 8 §11.1 permits it. Critical invariants require an identified repeatable verification method; critical failure modes require tested containment or recovery.</w:t>
       </w:r>
     </w:p>
     <w:p>
@@ -2460,7 +2462,7 @@
     </w:p>
     <w:p>
       <w:r>
-        <w:t>Status: Final. Control families: VER-004 VER-005 VER-006 GOV-006. Version: 1.0. Source authority: Book I then Book II.</w:t>
+        <w:t>Status: Owner-authorized working amendment; recertification pending. Control families: VER-004 VER-005 VER-006 GOV-006. Version: 1.1. Source authority: Book I then Book II.</w:t>
       </w:r>
     </w:p>
     <w:p>
@@ -2551,7 +2553,7 @@
     </w:p>
     <w:p>
       <w:r>
-        <w:t>Approval by an author alone, unresolved high-severity finding, or a debt item that conceals an authority or safety defect is prohibited.</w:t>
+        <w:t>Approval by an author alone, except for a documented Solo-Owner Assurance Profile under §11.1, unresolved high-severity finding, or a debt item that conceals an authority or safety defect is prohibited.</w:t>
       </w:r>
     </w:p>
     <w:p>
@@ -2590,7 +2592,33 @@
     </w:p>
     <w:p>
       <w:r>
-        <w:t>Independent reviewer for consequential changes; certification reviewers verify source traceability.</w:t>
+        <w:t>Independent reviewer for high-risk milestones and production release; certification reviewers verify source traceability. A documented Solo-Owner Assurance Profile may be used only for eligible routine, reversible, non-production work.</w:t>
+      </w:r>
+    </w:p>
+    <w:p>
+      <w:pPr>
+        <w:pStyle w:val="Heading2"/>
+      </w:pPr>
+      <w:r>
+        <w:t>11.1 Solo-Owner Assurance Profile</w:t>
+      </w:r>
+    </w:p>
+    <w:p>
+      <w:r>
+        <w:t>When no independent reviewer exists, the Owner may review an eligible change. The resulting record MUST identify the Owner as reviewer, declare that the review is not independent, state the risk classification and why the profile applies, cite governing sources, retain reproducible automated verification and evidence, resolve or contain findings, and record rollback/containment status. It MUST NOT be called independent review or independent certification.</w:t>
+      </w:r>
+    </w:p>
+    <w:p>
+      <w:pPr>
+        <w:pStyle w:val="Heading2"/>
+      </w:pPr>
+      <w:r>
+        <w:t>11.2 Independent-Review Threshold</w:t>
+      </w:r>
+    </w:p>
+    <w:p>
+      <w:r>
+        <w:t>Independent review remains required before production release or a high-risk milestone involving constitutional interpretation/change, Owner authority, a trust or security boundary, canonical knowledge semantics, evidence or recovery guarantees, a major architecture contract, a new capability or Treaty class, substantial irreversible migration/risk, or another Book I-reserved matter.</w:t>
       </w:r>
     </w:p>
     <w:p>
@@ -2668,7 +2696,7 @@
     </w:p>
     <w:p>
       <w:r>
-        <w:t>Verify through automated checks, independent review, and risk-scaled test/release evidence. Critical invariants require an identified repeatable verification method; critical failure modes require tested containment or recovery.</w:t>
+        <w:t>Verify through automated checks and risk-scaled test/release evidence, plus independent review or the documented Solo-Owner Assurance Profile where §11.1 permits it. Critical invariants require an identified repeatable verification method; critical failure modes require tested containment or recovery.</w:t>
       </w:r>
     </w:p>
     <w:p>
@@ -2793,7 +2821,7 @@
     </w:p>
     <w:p>
       <w:r>
-        <w:t>Status: Final. Control families: GOV-007 GOV-008 DOC-002 OPS-001. Version: 1.0. Source authority: Book I then Book II.</w:t>
+        <w:t>Status: Owner-authorized working amendment; recertification pending. Control families: GOV-007 GOV-008 DOC-002 OPS-001. Version: 1.1. Source authority: Book I then Book II.</w:t>
       </w:r>
     </w:p>
     <w:p>
@@ -3001,7 +3029,7 @@
     </w:p>
     <w:p>
       <w:r>
-        <w:t>Verify through automated checks, independent review, and risk-scaled test/release evidence. Critical invariants require an identified repeatable verification method; critical failure modes require tested containment or recovery.</w:t>
+        <w:t>Verify through automated checks and risk-scaled test/release evidence, plus independent review or the documented Solo-Owner Assurance Profile where Book III Chapter 8 §11.1 permits it. Critical invariants require an identified repeatable verification method; critical failure modes require tested containment or recovery.</w:t>
       </w:r>
     </w:p>
     <w:p>
@@ -3139,7 +3167,7 @@
     </w:p>
     <w:p>
       <w:r>
-        <w:t>This draft establishes the engineering-law baseline. Certification requires all control mappings, review records, deliverables, and validated renderings to be complete.</w:t>
+        <w:t>This Owner-authorized working amendment is not certified. Certification requires all control mappings, review records, deliverables, validated renderings, and the required qualified independent review to be complete.</w:t>
       </w:r>
     </w:p>
     <w:sectPr>
@@ -3162,7 +3190,7 @@
       <w:jc w:val="center"/>
     </w:pPr>
     <w:r>
-      <w:t>Final v1.0 | Controlled engineering standard</w:t>
+      <w:t>Working amendment v1.1 | Recertification pending</w:t>
     </w:r>
   </w:p>
 </w:ftr>

</xml_diff>